<commit_message>
Actualiza documentacion del Reto (2026-09-04)
</commit_message>
<xml_diff>
--- a/proyecto-reto/01-planeacion/Carta-Proyecto-Automatizacion-CNC.docx
+++ b/proyecto-reto/01-planeacion/Carta-Proyecto-Automatizacion-CNC.docx
@@ -8,6 +8,54 @@
       </w:pPr>
       <w:r>
         <w:t>Carta Proyecto</w:t>
+      </w:r>
+    </w:p>
+    <w:p>
+      <w:pPr>
+        <w:pStyle w:val="Heading2"/>
+      </w:pPr>
+      <w:r>
+        <w:t>Encargados del proyecto</w:t>
+      </w:r>
+    </w:p>
+    <w:p>
+      <w:pPr>
+        <w:pStyle w:val="ListBullet"/>
+      </w:pPr>
+      <w:r>
+        <w:t>Perla Cecilia Renteria Rodriguez</w:t>
+      </w:r>
+    </w:p>
+    <w:p>
+      <w:pPr>
+        <w:pStyle w:val="ListBullet"/>
+      </w:pPr>
+      <w:r>
+        <w:t>Samuel Sebastián Vázquez Gasca</w:t>
+      </w:r>
+    </w:p>
+    <w:p>
+      <w:pPr>
+        <w:pStyle w:val="ListBullet"/>
+      </w:pPr>
+      <w:r>
+        <w:t>Osmar Artemio González Alatorre</w:t>
+      </w:r>
+    </w:p>
+    <w:p>
+      <w:pPr>
+        <w:pStyle w:val="ListBullet"/>
+      </w:pPr>
+      <w:r>
+        <w:t>Rodrigo Herrera Baños</w:t>
+      </w:r>
+    </w:p>
+    <w:p>
+      <w:pPr>
+        <w:pStyle w:val="ListBullet"/>
+      </w:pPr>
+      <w:r>
+        <w:t>Diego Giovanni Castellanos García</w:t>
       </w:r>
     </w:p>
     <w:p>
@@ -28,64 +76,12 @@
         <w:pStyle w:val="Heading2"/>
       </w:pPr>
       <w:r>
-        <w:t>Socio formador</w:t>
-      </w:r>
-    </w:p>
-    <w:p>
-      <w:r>
-        <w:t xml:space="preserve">Organización: ⬜ </w:t>
-      </w:r>
-      <w:r>
-        <w:rPr>
-          <w:i/>
-        </w:rPr>
-        <w:t>por confirmar</w:t>
-      </w:r>
-    </w:p>
-    <w:p>
-      <w:r>
-        <w:t xml:space="preserve">Representante: ⬜ </w:t>
-      </w:r>
-      <w:r>
-        <w:rPr>
-          <w:i/>
-        </w:rPr>
-        <w:t>por confirmar</w:t>
-      </w:r>
-    </w:p>
-    <w:p>
-      <w:r>
-        <w:t xml:space="preserve">Cargo: ⬜ </w:t>
-      </w:r>
-      <w:r>
-        <w:rPr>
-          <w:i/>
-        </w:rPr>
-        <w:t>por confirmar</w:t>
-      </w:r>
-    </w:p>
-    <w:p>
-      <w:r>
-        <w:t xml:space="preserve">Contacto: ⬜ </w:t>
-      </w:r>
-      <w:r>
-        <w:rPr>
-          <w:i/>
-        </w:rPr>
-        <w:t>por confirmar</w:t>
-      </w:r>
-    </w:p>
-    <w:p>
-      <w:pPr>
-        <w:pStyle w:val="Heading2"/>
-      </w:pPr>
-      <w:r>
         <w:t>Duración del proyecto</w:t>
       </w:r>
     </w:p>
     <w:p>
       <w:r>
-        <w:t>18 semanas</w:t>
+        <w:t>17 semanas</w:t>
       </w:r>
     </w:p>
     <w:p>
@@ -98,7 +94,7 @@
     </w:p>
     <w:p>
       <w:r>
-        <w:t>En los talleres de manufactura, la carga y descarga de piezas en máquinas CNC normalmente requiere la intervención de un operador. Esto genera tiempos improductivos, aumenta la dependencia de trabajo manual y limita la automatización del proceso. Las soluciones comerciales de automatización mediante AGV y robots industriales suelen tener costos elevados, por lo tanto se propone desarrollar una celda automatizada de bajo costo que permita transportar, cargar, verificar y retirar piezas de un lugar especificado.</w:t>
+        <w:t>En los talleres de manufactura, la carga y descarga de piezas en máquinas CNC normalmente requiere la intervención de un operador. Esto genera tiempos improductivos, aumenta la dependencia de trabajo manual y limita la automatización del proceso, las soluciones comerciales de automatización mediante AGV y robot industriales suelen tener costos elevado, por lo tanto se propone desarrollar una celda automatizada de bajo costo que permita transportar, cargar, verificar y retirar piezas de un lugar especificado.</w:t>
       </w:r>
     </w:p>
     <w:p>
@@ -127,7 +123,7 @@
         <w:pStyle w:val="ListBullet"/>
       </w:pPr>
       <w:r>
-        <w:t>Diseñar y fabricar un AGV capaz de transportar las piezas dentro del taller o laboratorio.</w:t>
+        <w:t>Diseñar y fabricar un AGV capaz de transportar las piezas dentro del taller o laboratorio</w:t>
       </w:r>
     </w:p>
     <w:p>
@@ -135,7 +131,7 @@
         <w:pStyle w:val="ListBullet"/>
       </w:pPr>
       <w:r>
-        <w:t>Implementar navegación autónoma utilizando LiDAR.</w:t>
+        <w:t>implementar navegación autónoma utilizando LiDAR</w:t>
       </w:r>
     </w:p>
     <w:p>
@@ -143,7 +139,7 @@
         <w:pStyle w:val="ListBullet"/>
       </w:pPr>
       <w:r>
-        <w:t>Integrar un manipulador de 4 GDL sobre el chasis del AGV, el cual ayudará a realizar la carga y descarga de piezas.</w:t>
+        <w:t>Integrar un cobot sobre el chasis del AGV la cual ayudará a realizar la carga y descarga de piezas</w:t>
       </w:r>
     </w:p>
     <w:p>
@@ -151,7 +147,7 @@
         <w:pStyle w:val="ListBullet"/>
       </w:pPr>
       <w:r>
-        <w:t>Implementar un sistema de visión que determine si la pieza está correctamente colocada.</w:t>
+        <w:t>Implementar un sistema de visión que determine si la pieza está correctamente colocada</w:t>
       </w:r>
     </w:p>
     <w:p>
@@ -159,7 +155,7 @@
         <w:pStyle w:val="ListBullet"/>
       </w:pPr>
       <w:r>
-        <w:t>Validar el funcionamiento completo de la celda mediante pruebas de carga, descarga y validación.</w:t>
+        <w:t>Validar el funcionamiento completo de la celda mediante pruebas de carga, descarga y validación</w:t>
       </w:r>
     </w:p>
     <w:p>
@@ -172,12 +168,12 @@
     </w:p>
     <w:p>
       <w:r>
-        <w:t>Diseño e integración de un MoMa, entendido como una plataforma móvil con navegación inteligente y un manipulador robótico a bordo.</w:t>
+        <w:t>Diseño e integración de un MoMa, entendido como una plataforma móvil con navegación inteligente con un manipulador robótico.</w:t>
       </w:r>
     </w:p>
     <w:p>
       <w:r>
-        <w:t>Diseño e implementación de un manipulador robótico de 4 GDL integrado en la plataforma móvil, constituyendo un MoMa.</w:t>
+        <w:t>Diseño, implementación de un manipulador robótico de 4 GDL integrado en la plataforma móvil constituyendo un MoMa</w:t>
       </w:r>
     </w:p>
     <w:p>
@@ -217,12 +213,12 @@
     </w:p>
     <w:p>
       <w:r>
-        <w:t>Entregar y demostrar un prototipo funcional integrado.</w:t>
+        <w:t>Entregar y demostrar un prototipo funcional integrado</w:t>
       </w:r>
     </w:p>
     <w:p>
       <w:r>
-        <w:t>Consideramos la comunicación integrada entre la celda ciberfísica y la máquina CNC para coordinar el intercambio de información. Sin embargo, este último punto depende de la disponibilidad de uso y del permiso de trabajo en la CNC del Campus, por lo que, aunque el desarrollo de la comunicación forma parte del alcance, su validación contra la máquina real queda condicionada a que se otorgue dicho acceso. En caso de no obtenerlo, la comunicación se demostrará contra un entorno de simulación que reproduzca el comportamiento del control de la máquina.</w:t>
+        <w:t>Consideramos la comunicación integrada entre la celda ciber física y la máquina CNC para coordinar el intercambio de información sin embargo este último punto depende de la disponibilidad de uso y permiso de trabajo en la CNC del Campus, por lo que aunque lo consideramos dentro del alcance no aseguramos su cumplimiento.</w:t>
       </w:r>
     </w:p>
     <w:p>
@@ -235,7 +231,7 @@
     </w:p>
     <w:p>
       <w:r>
-        <w:t>Al finalizar el proyecto se espera obtener:</w:t>
+        <w:t>Al finalizar el proyecto se esperar obtener un</w:t>
       </w:r>
     </w:p>
     <w:p>
@@ -259,7 +255,7 @@
         <w:pStyle w:val="ListBullet"/>
       </w:pPr>
       <w:r>
-        <w:t>Estación de entrega de piezas</w:t>
+        <w:t>Estacion de entrega de piezas</w:t>
       </w:r>
     </w:p>
     <w:p>
@@ -267,7 +263,7 @@
         <w:pStyle w:val="ListBullet"/>
       </w:pPr>
       <w:r>
-        <w:t>Manipulador integrado al AGV</w:t>
+        <w:t>Cobot integrado al agv</w:t>
       </w:r>
     </w:p>
     <w:p>
@@ -275,7 +271,7 @@
         <w:pStyle w:val="ListBullet"/>
       </w:pPr>
       <w:r>
-        <w:t>Comunicación entre el supervisor y las máquinas o su simulación</w:t>
+        <w:t>Comunicación entre el supervisor y máquinas de simulación</w:t>
       </w:r>
     </w:p>
     <w:p>
@@ -307,7 +303,7 @@
         <w:pStyle w:val="ListBullet"/>
       </w:pPr>
       <w:r>
-        <w:t>Documentación técnica del proyecto</w:t>
+        <w:t>Documentar técnica del proyecto</w:t>
       </w:r>
     </w:p>
     <w:p>
@@ -332,18 +328,41 @@
       </w:r>
     </w:p>
     <w:p>
+      <w:pPr>
+        <w:pStyle w:val="Heading2"/>
+      </w:pPr>
       <w:r>
-        <w:t>La duración de 18 semanas es improrrogable, ya que está determinada por el calendario académico.</w:t>
+        <w:t>Supuestos</w:t>
       </w:r>
     </w:p>
     <w:p>
       <w:r>
-        <w:t>El acceso a la máquina CNC del Campus no está bajo control del equipo y depende de la programación del laboratorio.</w:t>
+        <w:t>La universidad proporcionará al menos un cobot industrial compatible con el proyecto</w:t>
       </w:r>
     </w:p>
     <w:p>
       <w:r>
-        <w:t>El microcontrolador NXP S32K312 no puede ejecutar ROS 2, por lo que se requiere una computadora con Linux como cómputo supervisor.</w:t>
+        <w:t>Habrá disponibilidad de un riel lineal o de los recursos necesarios para desarrollarlo e integrarlo</w:t>
+      </w:r>
+    </w:p>
+    <w:p>
+      <w:r>
+        <w:t>Será posible conseguir los sensores, cámaras, controladores y componentes mínimos necesarios para implementar el sistema.</w:t>
+      </w:r>
+    </w:p>
+    <w:p>
+      <w:r>
+        <w:t>El socio formador seguirá disponible para resolver dudas relevantes cuando sea necesario.</w:t>
+      </w:r>
+    </w:p>
+    <w:p>
+      <w:r>
+        <w:t>Los requisitos académicos y del socio formador no cambiarán drásticamente durante el semestre.</w:t>
+      </w:r>
+    </w:p>
+    <w:p>
+      <w:r>
+        <w:t>El equipo tendrá acceso a software y herramientas necesarias para desarrollo, simulación, programación y documentación.</w:t>
       </w:r>
     </w:p>
     <w:p>
@@ -451,146 +470,75 @@
       </w:r>
     </w:p>
     <w:p>
+      <w:pPr>
+        <w:pStyle w:val="ListBullet"/>
+      </w:pPr>
       <w:r>
-        <w:rPr>
-          <w:b/>
-        </w:rPr>
-        <w:t>Fabricar el manipulador de 4 GDL puede consumir el semestre completo.</w:t>
-      </w:r>
-      <w:r>
-        <w:t xml:space="preserve"> Diseñar, maquinar, ensamblar y controlar un brazo propio es un proyecto por sí mismo. Para evitarlo, el diseño del manipulador se congela al cierre de la semana 7 sin excepción; si para entonces no está resuelto, se reduce a 3 grados de libertad o se sustituye por un brazo educativo comercial.</w:t>
+        <w:t>Retrasos en la planeación, manufactura de los componente</w:t>
       </w:r>
     </w:p>
     <w:p>
+      <w:pPr>
+        <w:pStyle w:val="ListBullet"/>
+      </w:pPr>
       <w:r>
-        <w:rPr>
-          <w:b/>
-        </w:rPr>
-        <w:t>El cobot industrial para el riel lineal podría no estar disponible</w:t>
-      </w:r>
-      <w:r>
-        <w:t xml:space="preserve"> cuando llegue la fase de integración. Se debe confirmar modelo y fecha de disponibilidad con el socio formador de inmediato. Si no se consigue, la transferencia de piezas se demuestra con el manipulador del propio MoMa.</w:t>
+        <w:t>Baja precisión en el posicionamiento de los objetos</w:t>
       </w:r>
     </w:p>
     <w:p>
+      <w:pPr>
+        <w:pStyle w:val="ListBullet"/>
+      </w:pPr>
       <w:r>
-        <w:rPr>
-          <w:b/>
-        </w:rPr>
-        <w:t>Los componentes con mayor tiempo de entrega pueden llegar tarde.</w:t>
-      </w:r>
-      <w:r>
-        <w:t xml:space="preserve"> El cómputo supervisor y la batería tienen cinco semanas de plazo de entrega, por lo que sus órdenes de compra deben emitirse antes del 29 de septiembre. Mientras llegan, la navegación se desarrolla en simulación para no detener el avance.</w:t>
+        <w:t>Fallas de sensores o cámaras integradas</w:t>
       </w:r>
     </w:p>
     <w:p>
+      <w:pPr>
+        <w:pStyle w:val="ListBullet"/>
+      </w:pPr>
       <w:r>
-        <w:rPr>
-          <w:b/>
-        </w:rPr>
-        <w:t>El acceso a la máquina CNC del Campus no está garantizado.</w:t>
-      </w:r>
-      <w:r>
-        <w:t xml:space="preserve"> La ventana de trabajo debe reservarse desde ahora con el laboratorio. Si no se obtiene, la comunicación se valida contra un entorno de simulación que reproduzca el comportamiento del control.</w:t>
+        <w:t>Problemas de comunicación (falta de wifi)</w:t>
       </w:r>
     </w:p>
     <w:p>
+      <w:pPr>
+        <w:pStyle w:val="ListBullet"/>
+      </w:pPr>
       <w:r>
-        <w:rPr>
-          <w:b/>
-        </w:rPr>
-        <w:t>El peso del manipulador puede desestabilizar el AGV.</w:t>
-      </w:r>
-      <w:r>
-        <w:t xml:space="preserve"> Montar un brazo sobre la plataforma eleva el centro de gravedad y genera par de vuelco cuando el brazo se extiende. Se debe realizar el análisis de estabilidad antes de fabricar el chasis y limitar la velocidad de desplazamiento con el brazo extendido; de ser necesario, se amplía la base o se agrega contrapeso.</w:t>
+        <w:t>Errores en la manipulación de piezas por el cobot</w:t>
       </w:r>
     </w:p>
     <w:p>
+      <w:pPr>
+        <w:pStyle w:val="ListBullet"/>
+      </w:pPr>
       <w:r>
-        <w:rPr>
-          <w:b/>
-        </w:rPr>
-        <w:t>La precisión de posicionamiento del AGV podría no ser suficiente</w:t>
-      </w:r>
-      <w:r>
-        <w:t xml:space="preserve"> para que el manipulador tome la pieza correctamente. La tolerancia debe definirse con un número concreto en las primeras semanas y diseñarse hacia ella. Si la odometría no alcanza, se corrige con realimentación visual en el momento del acoplamiento.</w:t>
+        <w:t>Fallas en el sistema de visión</w:t>
       </w:r>
     </w:p>
     <w:p>
+      <w:pPr>
+        <w:pStyle w:val="ListBullet"/>
+      </w:pPr>
       <w:r>
-        <w:rPr>
-          <w:b/>
-        </w:rPr>
-        <w:t>La restricción de bajo costo entra en tensión con la precisión requerida.</w:t>
-      </w:r>
-      <w:r>
-        <w:t xml:space="preserve"> Los componentes accesibles tienen más juego mecánico y menor repetibilidad. La estrategia es compensar en software mediante realimentación visual antes que recurrir a hardware más caro, lo cual además refuerza la propuesta de valor del proyecto.</w:t>
+        <w:t>Aumento de costos en el proyecto</w:t>
       </w:r>
     </w:p>
     <w:p>
+      <w:pPr>
+        <w:pStyle w:val="ListBullet"/>
+      </w:pPr>
       <w:r>
-        <w:rPr>
-          <w:b/>
-        </w:rPr>
-        <w:t>El consumo del manipulador puede reducir la autonomía del AGV</w:t>
-      </w:r>
-      <w:r>
-        <w:t xml:space="preserve"> por debajo de lo necesario para completar un ciclo. Se debe elaborar el presupuesto energético durante el diseño eléctrico y, en caso necesario, contemplar una recarga intermedia dentro del ciclo.</w:t>
+        <w:t>Problemas al momento de integración</w:t>
       </w:r>
     </w:p>
     <w:p>
+      <w:pPr>
+        <w:pStyle w:val="ListBullet"/>
+      </w:pPr>
       <w:r>
-        <w:rPr>
-          <w:b/>
-        </w:rPr>
-        <w:t>El microcontrolador podría no sostener simultáneamente el lazo de tracción y el del manipulador.</w:t>
-      </w:r>
-      <w:r>
-        <w:t xml:space="preserve"> La frecuencia de lazo debe medirse en la fase temprana de firmware. Si no alcanza, se dedica un segundo microcontrolador al brazo.</w:t>
-      </w:r>
-    </w:p>
-    <w:p>
-      <w:r>
-        <w:rPr>
-          <w:b/>
-        </w:rPr>
-        <w:t>La ciberseguridad suele tratarse como un accesorio y descubrirse al final.</w:t>
-      </w:r>
-      <w:r>
-        <w:t xml:space="preserve"> Debe incorporarse desde el diseño de la arquitectura de comunicación, no en la última semana.</w:t>
-      </w:r>
-    </w:p>
-    <w:p>
-      <w:r>
-        <w:rPr>
-          <w:b/>
-        </w:rPr>
-        <w:t>La iluminación del taller puede degradar el sistema de visión</w:t>
-      </w:r>
-      <w:r>
-        <w:t xml:space="preserve"> por efecto de viruta, refrigerante y sombras cambiantes. La estación de inspección debe contar con iluminación propia controlada.</w:t>
-      </w:r>
-    </w:p>
-    <w:p>
-      <w:r>
-        <w:rPr>
-          <w:b/>
-        </w:rPr>
-        <w:t>La carga de trabajo puede repartirse de forma desigual entre los integrantes.</w:t>
-      </w:r>
-      <w:r>
-        <w:t xml:space="preserve"> Se mitiga con una matriz de responsabilidades explícita y revisión semanal del avance en el tablero del equipo.</w:t>
-      </w:r>
-    </w:p>
-    <w:p>
-      <w:r>
-        <w:rPr>
-          <w:b/>
-        </w:rPr>
-        <w:t>El alcance del manipulador puede malinterpretarse.</w:t>
-      </w:r>
-      <w:r>
-        <w:t xml:space="preserve"> El proyecto contempla un manipulador de 4 GDL de fabricación propia sobre el AGV y, además, un cobot industrial comercial sobre el riel lineal. Son elementos distintos, con proveeduría y calendario distintos. Esta interpretación debe confirmarse por escrito con el socio formador antes de la semana 5, ya que de ella dependen el presupuesto y el calendario completos.</w:t>
+        <w:t>Riesgos o falla de seguridad</w:t>
       </w:r>
     </w:p>
     <w:sectPr>

</xml_diff>